<commit_message>
Pfilchtenheft ergänzt. (Kapitel 2, 4, 6)
</commit_message>
<xml_diff>
--- a/Ressourcen/AP08_Pflichteneheft01.docx
+++ b/Ressourcen/AP08_Pflichteneheft01.docx
@@ -114,9 +114,11 @@
             <w:vAlign w:val="center"/>
           </w:tcPr>
           <w:p>
+            <w:proofErr w:type="spellStart"/>
             <w:r>
               <w:t>StempelApp</w:t>
             </w:r>
+            <w:proofErr w:type="spellEnd"/>
           </w:p>
         </w:tc>
       </w:tr>
@@ -152,8 +154,13 @@
           </w:tcPr>
           <w:p>
             <w:r>
-              <w:t>Roman-Peter Poczesniok</w:t>
-            </w:r>
+              <w:t xml:space="preserve">Roman-Peter </w:t>
+            </w:r>
+            <w:proofErr w:type="spellStart"/>
+            <w:r>
+              <w:t>Poczesniok</w:t>
+            </w:r>
+            <w:proofErr w:type="spellEnd"/>
           </w:p>
         </w:tc>
       </w:tr>
@@ -226,7 +233,10 @@
           </w:tcPr>
           <w:p>
             <w:r>
-              <w:t>18.09.2025</w:t>
+              <w:t>25</w:t>
+            </w:r>
+            <w:r>
+              <w:t>.09.2025</w:t>
             </w:r>
           </w:p>
         </w:tc>
@@ -309,6 +319,9 @@
           <w:p>
             <w:r>
               <w:t>1</w:t>
+            </w:r>
+            <w:r>
+              <w:t>.1</w:t>
             </w:r>
           </w:p>
         </w:tc>
@@ -351,10 +364,10 @@
         <w:gridCol w:w="498"/>
         <w:gridCol w:w="1220"/>
         <w:gridCol w:w="914"/>
-        <w:gridCol w:w="1899"/>
-        <w:gridCol w:w="1831"/>
+        <w:gridCol w:w="1795"/>
+        <w:gridCol w:w="1730"/>
         <w:gridCol w:w="1593"/>
-        <w:gridCol w:w="1107"/>
+        <w:gridCol w:w="1312"/>
       </w:tblGrid>
       <w:tr>
         <w:trPr>
@@ -599,49 +612,77 @@
             <w:tcW w:w="498" w:type="dxa"/>
             <w:vAlign w:val="center"/>
           </w:tcPr>
-          <w:p/>
+          <w:p>
+            <w:r>
+              <w:t>2</w:t>
+            </w:r>
+          </w:p>
         </w:tc>
         <w:tc>
           <w:tcPr>
             <w:tcW w:w="1220" w:type="dxa"/>
             <w:vAlign w:val="center"/>
           </w:tcPr>
-          <w:p/>
+          <w:p>
+            <w:r>
+              <w:t>25.09.2025</w:t>
+            </w:r>
+          </w:p>
         </w:tc>
         <w:tc>
           <w:tcPr>
             <w:tcW w:w="914" w:type="dxa"/>
             <w:vAlign w:val="center"/>
           </w:tcPr>
-          <w:p/>
+          <w:p>
+            <w:r>
+              <w:t>1.1</w:t>
+            </w:r>
+          </w:p>
         </w:tc>
         <w:tc>
           <w:tcPr>
             <w:tcW w:w="1899" w:type="dxa"/>
             <w:vAlign w:val="center"/>
           </w:tcPr>
-          <w:p/>
+          <w:p>
+            <w:r>
+              <w:t xml:space="preserve">2, 4, 6, </w:t>
+            </w:r>
+          </w:p>
         </w:tc>
         <w:tc>
           <w:tcPr>
             <w:tcW w:w="1831" w:type="dxa"/>
             <w:vAlign w:val="center"/>
           </w:tcPr>
-          <w:p/>
+          <w:p>
+            <w:r>
+              <w:t>Ergänzung</w:t>
+            </w:r>
+          </w:p>
         </w:tc>
         <w:tc>
           <w:tcPr>
             <w:tcW w:w="1593" w:type="dxa"/>
             <w:vAlign w:val="center"/>
           </w:tcPr>
-          <w:p/>
+          <w:p>
+            <w:r>
+              <w:t>J. Lichtenegger</w:t>
+            </w:r>
+          </w:p>
         </w:tc>
         <w:tc>
           <w:tcPr>
             <w:tcW w:w="1107" w:type="dxa"/>
             <w:vAlign w:val="center"/>
           </w:tcPr>
-          <w:p/>
+          <w:p>
+            <w:r>
+              <w:t>In Bearbeitung</w:t>
+            </w:r>
+          </w:p>
         </w:tc>
       </w:tr>
       <w:tr>
@@ -919,7 +960,6 @@
           <w:sz w:val="28"/>
           <w:szCs w:val="28"/>
         </w:rPr>
-        <w:lastRenderedPageBreak/>
         <w:t>Inhalt</w:t>
       </w:r>
     </w:p>
@@ -1032,11 +1072,16 @@
         <w:t>r</w:t>
       </w:r>
       <w:r>
-        <w:t xml:space="preserve"> Anbieter</w:t>
+        <w:t xml:space="preserve"> </w:t>
+      </w:r>
+      <w:proofErr w:type="spellStart"/>
+      <w:r>
+        <w:t>Anbieter</w:t>
       </w:r>
       <w:r>
         <w:t>:innen</w:t>
       </w:r>
+      <w:proofErr w:type="spellEnd"/>
     </w:p>
     <w:p>
       <w:pPr>
@@ -1049,11 +1094,16 @@
         <w:t>r</w:t>
       </w:r>
       <w:r>
-        <w:t xml:space="preserve"> Anwender</w:t>
+        <w:t xml:space="preserve"> </w:t>
+      </w:r>
+      <w:proofErr w:type="spellStart"/>
+      <w:r>
+        <w:t>Anwender</w:t>
       </w:r>
       <w:r>
         <w:t>:innen</w:t>
       </w:r>
+      <w:proofErr w:type="spellEnd"/>
     </w:p>
     <w:p>
       <w:pPr>
@@ -1331,39 +1381,59 @@
       <w:r>
         <w:t xml:space="preserve">Das vorliegende Pflichtenheft enthält die an das zu entwickelnde Produkt gestellten funktionalen sowie nicht-funktionalen Anforderungen. Es dient als Basis für die Ausschreibung und Vertragsgestaltung und bildet somit die Vorgabe für die Angebotserstellung. Kommt es zwischen </w:t>
       </w:r>
-      <w:r>
-        <w:rPr>
-          <w:color w:val="FF4554"/>
-        </w:rPr>
-        <w:t xml:space="preserve">Auftragnehmer:in </w:t>
+      <w:proofErr w:type="spellStart"/>
+      <w:r>
+        <w:rPr>
+          <w:color w:val="FF4554"/>
+        </w:rPr>
+        <w:t>Auftragnehmer:in</w:t>
+      </w:r>
+      <w:proofErr w:type="spellEnd"/>
+      <w:r>
+        <w:rPr>
+          <w:color w:val="FF4554"/>
+        </w:rPr>
+        <w:t xml:space="preserve"> </w:t>
       </w:r>
       <w:r>
         <w:t xml:space="preserve">und </w:t>
       </w:r>
-      <w:r>
-        <w:rPr>
-          <w:color w:val="FF4554"/>
-        </w:rPr>
-        <w:t xml:space="preserve">Auftraggeber:in </w:t>
+      <w:proofErr w:type="spellStart"/>
+      <w:r>
+        <w:rPr>
+          <w:color w:val="FF4554"/>
+        </w:rPr>
+        <w:t>Auftraggeber:in</w:t>
+      </w:r>
+      <w:proofErr w:type="spellEnd"/>
+      <w:r>
+        <w:rPr>
+          <w:color w:val="FF4554"/>
+        </w:rPr>
+        <w:t xml:space="preserve"> </w:t>
       </w:r>
       <w:r>
         <w:t xml:space="preserve">zu einem Vertragsabschluss, ist das bestehende Pflichtenheft rechtlich bindend. Alle zuvor zwischen </w:t>
       </w:r>
+      <w:proofErr w:type="spellStart"/>
       <w:r>
         <w:rPr>
           <w:color w:val="FF4554"/>
         </w:rPr>
         <w:t>Auftraggeber:in</w:t>
       </w:r>
+      <w:proofErr w:type="spellEnd"/>
       <w:r>
         <w:t xml:space="preserve"> und </w:t>
       </w:r>
+      <w:proofErr w:type="spellStart"/>
       <w:r>
         <w:rPr>
           <w:color w:val="FF4554"/>
         </w:rPr>
         <w:t>Auftragnehmer:in</w:t>
       </w:r>
+      <w:proofErr w:type="spellEnd"/>
       <w:r>
         <w:t xml:space="preserve"> getroffenen Absprachen verlieren in der Regel durch das Pflichtenheft ihre Gültigkeit – sofern hier nichts Gegenteiliges vermerkt ist. Mit den Anforderungen werden die Rahmenbedingungen für die Entwicklung festgelegt, </w:t>
       </w:r>
@@ -1371,7 +1441,21 @@
         <w:rPr>
           <w:color w:val="FF4554"/>
         </w:rPr>
-        <w:t xml:space="preserve">die von dem oder der Auftragnehmer:in </w:t>
+        <w:t xml:space="preserve">die von dem oder der </w:t>
+      </w:r>
+      <w:proofErr w:type="spellStart"/>
+      <w:r>
+        <w:rPr>
+          <w:color w:val="FF4554"/>
+        </w:rPr>
+        <w:t>Auftragnehmer:in</w:t>
+      </w:r>
+      <w:proofErr w:type="spellEnd"/>
+      <w:r>
+        <w:rPr>
+          <w:color w:val="FF4554"/>
+        </w:rPr>
+        <w:t xml:space="preserve"> </w:t>
       </w:r>
       <w:r>
         <w:t>im Pflichtenheft detailliert ausgestaltet werden.</w:t>
@@ -1412,31 +1496,83 @@
         <w:t>2.1 Ziel und Zweck des Dokuments</w:t>
       </w:r>
     </w:p>
+    <w:p>
+      <w:r>
+        <w:t xml:space="preserve">Dieses </w:t>
+      </w:r>
+      <w:r>
+        <w:t>Pflichtenheft</w:t>
+      </w:r>
+      <w:r>
+        <w:t xml:space="preserve"> beschreibt ei</w:t>
+      </w:r>
+      <w:r>
+        <w:t xml:space="preserve">ne </w:t>
+      </w:r>
+      <w:r>
+        <w:t>Web-</w:t>
+      </w:r>
+      <w:r>
+        <w:t xml:space="preserve">Applikation </w:t>
+      </w:r>
+      <w:r>
+        <w:t xml:space="preserve">für Smartphones </w:t>
+      </w:r>
+      <w:r>
+        <w:t xml:space="preserve">zur Digitalisierung </w:t>
+      </w:r>
+      <w:r>
+        <w:t>eines Zeiterfassungszettels für Reinigungskräfte.</w:t>
+      </w:r>
+    </w:p>
     <w:p/>
     <w:p>
-      <w:r>
-        <w:t xml:space="preserve">Dieses </w:t>
-      </w:r>
-      <w:r>
-        <w:t>Pflichtenheft</w:t>
-      </w:r>
-      <w:r>
-        <w:t xml:space="preserve"> beschreibt ei</w:t>
-      </w:r>
-      <w:r>
-        <w:t xml:space="preserve">ne </w:t>
-      </w:r>
-      <w:r>
-        <w:t>Web-</w:t>
-      </w:r>
-      <w:r>
-        <w:t xml:space="preserve">Applikation </w:t>
-      </w:r>
-      <w:r>
-        <w:t xml:space="preserve">zur Digitalisierung </w:t>
-      </w:r>
-      <w:r>
-        <w:t>eines Zeiterfassungszettels für Reinigungskräfte.</w:t>
+      <w:pPr>
+        <w:rPr>
+          <w:b/>
+          <w:bCs/>
+        </w:rPr>
+      </w:pPr>
+      <w:r>
+        <w:rPr>
+          <w:b/>
+          <w:bCs/>
+        </w:rPr>
+        <w:t>2.2 Ausgangssituation</w:t>
+      </w:r>
+    </w:p>
+    <w:p>
+      <w:pPr>
+        <w:rPr>
+          <w:color w:val="FF4554"/>
+        </w:rPr>
+      </w:pPr>
+      <w:r>
+        <w:t>Unser Auftraggebe</w:t>
+      </w:r>
+      <w:r>
+        <w:t xml:space="preserve">r, Wiener-Reinigung.at, </w:t>
+      </w:r>
+      <w:r>
+        <w:t>möchte eine</w:t>
+      </w:r>
+      <w:r>
+        <w:t xml:space="preserve"> digitale</w:t>
+      </w:r>
+      <w:r>
+        <w:t xml:space="preserve"> Arbeitszeiterfassung für Mobil-Telefone</w:t>
+      </w:r>
+      <w:r>
+        <w:t xml:space="preserve">, für </w:t>
+      </w:r>
+      <w:r>
+        <w:t xml:space="preserve">das </w:t>
+      </w:r>
+      <w:r>
+        <w:t xml:space="preserve">eigene </w:t>
+      </w:r>
+      <w:r>
+        <w:t>Reinigungspersonal. (siehe Anfrage.docx)</w:t>
       </w:r>
     </w:p>
     <w:p/>
@@ -1452,35 +1588,15 @@
           <w:b/>
           <w:bCs/>
         </w:rPr>
-        <w:t>2.2 Ausgangssituation</w:t>
-      </w:r>
-    </w:p>
-    <w:p>
-      <w:pPr>
-        <w:rPr>
-          <w:color w:val="FF4554"/>
-        </w:rPr>
-      </w:pPr>
-      <w:r>
-        <w:t>Unser Auftraggebe</w:t>
-      </w:r>
-      <w:r>
-        <w:t xml:space="preserve">r, Wiener-Reinigung.at, </w:t>
-      </w:r>
-      <w:r>
-        <w:t>möchte eine</w:t>
-      </w:r>
-      <w:r>
-        <w:t xml:space="preserve"> digitale</w:t>
-      </w:r>
-      <w:r>
-        <w:t xml:space="preserve"> Arbeitszeiterfassung für Mobil-Telefone</w:t>
-      </w:r>
-      <w:r>
-        <w:t xml:space="preserve">, für </w:t>
-      </w:r>
-      <w:r>
-        <w:t>das Reinigungspersonal. (siehe Anfrage.docx)</w:t>
+        <w:t>2.3 Projektbezug</w:t>
+      </w:r>
+    </w:p>
+    <w:p>
+      <w:r>
+        <w:t>Das vorliegende Projekt ist ein unabhängiges Projekt</w:t>
+      </w:r>
+      <w:r>
+        <w:t>.</w:t>
       </w:r>
     </w:p>
     <w:p/>
@@ -1496,46 +1612,46 @@
           <w:b/>
           <w:bCs/>
         </w:rPr>
-        <w:t>2.3 Projektbezug</w:t>
-      </w:r>
-    </w:p>
-    <w:p/>
-    <w:p>
-      <w:r>
-        <w:t>Das vorliegende Projekt ist ein unabhängiges Projekt</w:t>
-      </w:r>
-      <w:r>
-        <w:t>.</w:t>
-      </w:r>
-    </w:p>
-    <w:p/>
-    <w:p>
-      <w:pPr>
-        <w:rPr>
-          <w:b/>
-          <w:bCs/>
-        </w:rPr>
-      </w:pPr>
-      <w:r>
-        <w:rPr>
-          <w:b/>
-          <w:bCs/>
-        </w:rPr>
         <w:t>2.4 Abkürzungen</w:t>
       </w:r>
     </w:p>
-    <w:p/>
-    <w:p>
-      <w:pPr>
-        <w:rPr>
-          <w:color w:val="FF4554"/>
-        </w:rPr>
-      </w:pPr>
-      <w:r>
-        <w:rPr>
-          <w:color w:val="FF4554"/>
-        </w:rPr>
-        <w:t>[Auflistung aller eingeführten und verwendeten Abkürzungen]</w:t>
+    <w:p>
+      <w:r>
+        <w:t>AG – Auftraggeber (Wiener-Reinigung.at)</w:t>
+      </w:r>
+    </w:p>
+    <w:p>
+      <w:r>
+        <w:t>RK – Reinigungskraft (Angestellte des AG)</w:t>
+      </w:r>
+    </w:p>
+    <w:p>
+      <w:r>
+        <w:t>KU</w:t>
+      </w:r>
+      <w:r>
+        <w:t xml:space="preserve"> </w:t>
+      </w:r>
+      <w:r>
+        <w:t xml:space="preserve">– </w:t>
+      </w:r>
+      <w:r>
+        <w:t>Kunden des Reinigungsservice des AG</w:t>
+      </w:r>
+    </w:p>
+    <w:p>
+      <w:r>
+        <w:t>MA – Mitarbeiter</w:t>
+      </w:r>
+    </w:p>
+    <w:p>
+      <w:r>
+        <w:t>RP – Reinigungsprojekte</w:t>
+      </w:r>
+    </w:p>
+    <w:p>
+      <w:r>
+        <w:t>AN – Auftragnehmer (AP08)</w:t>
       </w:r>
     </w:p>
     <w:p>
@@ -1624,7 +1740,7 @@
     <w:tbl>
       <w:tblPr>
         <w:tblStyle w:val="Tabellenraster"/>
-        <w:tblW w:w="9351" w:type="dxa"/>
+        <w:tblW w:w="8784" w:type="dxa"/>
         <w:tblBorders>
           <w:top w:val="single" w:sz="4" w:space="0" w:color="D9D9D9" w:themeColor="background1" w:themeShade="D9"/>
           <w:left w:val="single" w:sz="4" w:space="0" w:color="D9D9D9" w:themeColor="background1" w:themeShade="D9"/>
@@ -1636,10 +1752,9 @@
         <w:tblLook w:val="04A0" w:firstRow="1" w:lastRow="0" w:firstColumn="1" w:lastColumn="0" w:noHBand="0" w:noVBand="1"/>
       </w:tblPr>
       <w:tblGrid>
-        <w:gridCol w:w="1650"/>
-        <w:gridCol w:w="1729"/>
-        <w:gridCol w:w="4092"/>
-        <w:gridCol w:w="1880"/>
+        <w:gridCol w:w="2689"/>
+        <w:gridCol w:w="3402"/>
+        <w:gridCol w:w="2693"/>
       </w:tblGrid>
       <w:tr>
         <w:trPr>
@@ -1647,7 +1762,7 @@
         </w:trPr>
         <w:tc>
           <w:tcPr>
-            <w:tcW w:w="1650" w:type="dxa"/>
+            <w:tcW w:w="2689" w:type="dxa"/>
             <w:vAlign w:val="center"/>
           </w:tcPr>
           <w:p>
@@ -1668,7 +1783,7 @@
         </w:tc>
         <w:tc>
           <w:tcPr>
-            <w:tcW w:w="1729" w:type="dxa"/>
+            <w:tcW w:w="3402" w:type="dxa"/>
             <w:vAlign w:val="center"/>
           </w:tcPr>
           <w:p>
@@ -1689,7 +1804,7 @@
         </w:tc>
         <w:tc>
           <w:tcPr>
-            <w:tcW w:w="4092" w:type="dxa"/>
+            <w:tcW w:w="2693" w:type="dxa"/>
             <w:vAlign w:val="center"/>
           </w:tcPr>
           <w:p>
@@ -1704,27 +1819,6 @@
                 <w:b/>
                 <w:bCs/>
               </w:rPr>
-              <w:t>E-Mail</w:t>
-            </w:r>
-          </w:p>
-        </w:tc>
-        <w:tc>
-          <w:tcPr>
-            <w:tcW w:w="1880" w:type="dxa"/>
-            <w:vAlign w:val="center"/>
-          </w:tcPr>
-          <w:p>
-            <w:pPr>
-              <w:rPr>
-                <w:b/>
-                <w:bCs/>
-              </w:rPr>
-            </w:pPr>
-            <w:r>
-              <w:rPr>
-                <w:b/>
-                <w:bCs/>
-              </w:rPr>
               <w:t>Team</w:t>
             </w:r>
           </w:p>
@@ -1736,46 +1830,34 @@
         </w:trPr>
         <w:tc>
           <w:tcPr>
-            <w:tcW w:w="1650" w:type="dxa"/>
-            <w:vAlign w:val="center"/>
-          </w:tcPr>
-          <w:p>
-            <w:r>
-              <w:t>Pro</w:t>
-            </w:r>
-            <w:r>
-              <w:t>jekt</w:t>
-            </w:r>
-            <w:r>
-              <w:t>manager</w:t>
-            </w:r>
-          </w:p>
-        </w:tc>
-        <w:tc>
-          <w:tcPr>
-            <w:tcW w:w="1729" w:type="dxa"/>
-            <w:vAlign w:val="center"/>
-          </w:tcPr>
-          <w:p>
-            <w:r>
-              <w:t>Roman-Peter Poczesniok</w:t>
-            </w:r>
-          </w:p>
-        </w:tc>
-        <w:tc>
-          <w:tcPr>
-            <w:tcW w:w="4092" w:type="dxa"/>
-            <w:vAlign w:val="center"/>
-          </w:tcPr>
-          <w:p>
-            <w:r>
-              <w:t>romanpeter.poczesniok2@qualifizierung.at</w:t>
-            </w:r>
-          </w:p>
-        </w:tc>
-        <w:tc>
-          <w:tcPr>
-            <w:tcW w:w="1880" w:type="dxa"/>
+            <w:tcW w:w="2689" w:type="dxa"/>
+            <w:vAlign w:val="center"/>
+          </w:tcPr>
+          <w:p>
+            <w:r>
+              <w:t>Projektmanager</w:t>
+            </w:r>
+          </w:p>
+        </w:tc>
+        <w:tc>
+          <w:tcPr>
+            <w:tcW w:w="3402" w:type="dxa"/>
+            <w:vAlign w:val="center"/>
+          </w:tcPr>
+          <w:p>
+            <w:r>
+              <w:t xml:space="preserve">Roman-Peter </w:t>
+            </w:r>
+            <w:proofErr w:type="spellStart"/>
+            <w:r>
+              <w:t>Poczesniok</w:t>
+            </w:r>
+            <w:proofErr w:type="spellEnd"/>
+          </w:p>
+        </w:tc>
+        <w:tc>
+          <w:tcPr>
+            <w:tcW w:w="2693" w:type="dxa"/>
             <w:vAlign w:val="center"/>
           </w:tcPr>
           <w:p/>
@@ -1787,32 +1869,30 @@
         </w:trPr>
         <w:tc>
           <w:tcPr>
-            <w:tcW w:w="1650" w:type="dxa"/>
+            <w:tcW w:w="2689" w:type="dxa"/>
             <w:vAlign w:val="center"/>
           </w:tcPr>
           <w:p/>
         </w:tc>
         <w:tc>
           <w:tcPr>
-            <w:tcW w:w="1729" w:type="dxa"/>
-            <w:vAlign w:val="center"/>
-          </w:tcPr>
-          <w:p>
-            <w:r>
-              <w:t>Philip Jebavy</w:t>
-            </w:r>
-          </w:p>
-        </w:tc>
-        <w:tc>
-          <w:tcPr>
-            <w:tcW w:w="4092" w:type="dxa"/>
-            <w:vAlign w:val="center"/>
-          </w:tcPr>
-          <w:p/>
-        </w:tc>
-        <w:tc>
-          <w:tcPr>
-            <w:tcW w:w="1880" w:type="dxa"/>
+            <w:tcW w:w="3402" w:type="dxa"/>
+            <w:vAlign w:val="center"/>
+          </w:tcPr>
+          <w:p>
+            <w:r>
+              <w:t xml:space="preserve">Philip </w:t>
+            </w:r>
+            <w:proofErr w:type="spellStart"/>
+            <w:r>
+              <w:t>Jebavy</w:t>
+            </w:r>
+            <w:proofErr w:type="spellEnd"/>
+          </w:p>
+        </w:tc>
+        <w:tc>
+          <w:tcPr>
+            <w:tcW w:w="2693" w:type="dxa"/>
             <w:vAlign w:val="center"/>
           </w:tcPr>
           <w:p>
@@ -1828,14 +1908,14 @@
         </w:trPr>
         <w:tc>
           <w:tcPr>
-            <w:tcW w:w="1650" w:type="dxa"/>
+            <w:tcW w:w="2689" w:type="dxa"/>
             <w:vAlign w:val="center"/>
           </w:tcPr>
           <w:p/>
         </w:tc>
         <w:tc>
           <w:tcPr>
-            <w:tcW w:w="1729" w:type="dxa"/>
+            <w:tcW w:w="3402" w:type="dxa"/>
             <w:vAlign w:val="center"/>
           </w:tcPr>
           <w:p>
@@ -1846,14 +1926,7 @@
         </w:tc>
         <w:tc>
           <w:tcPr>
-            <w:tcW w:w="4092" w:type="dxa"/>
-            <w:vAlign w:val="center"/>
-          </w:tcPr>
-          <w:p/>
-        </w:tc>
-        <w:tc>
-          <w:tcPr>
-            <w:tcW w:w="1880" w:type="dxa"/>
+            <w:tcW w:w="2693" w:type="dxa"/>
             <w:vAlign w:val="center"/>
           </w:tcPr>
           <w:p>
@@ -1869,14 +1942,14 @@
         </w:trPr>
         <w:tc>
           <w:tcPr>
-            <w:tcW w:w="1650" w:type="dxa"/>
+            <w:tcW w:w="2689" w:type="dxa"/>
             <w:vAlign w:val="center"/>
           </w:tcPr>
           <w:p/>
         </w:tc>
         <w:tc>
           <w:tcPr>
-            <w:tcW w:w="1729" w:type="dxa"/>
+            <w:tcW w:w="3402" w:type="dxa"/>
             <w:vAlign w:val="center"/>
           </w:tcPr>
           <w:p>
@@ -1887,14 +1960,7 @@
         </w:tc>
         <w:tc>
           <w:tcPr>
-            <w:tcW w:w="4092" w:type="dxa"/>
-            <w:vAlign w:val="center"/>
-          </w:tcPr>
-          <w:p/>
-        </w:tc>
-        <w:tc>
-          <w:tcPr>
-            <w:tcW w:w="1880" w:type="dxa"/>
+            <w:tcW w:w="2693" w:type="dxa"/>
             <w:vAlign w:val="center"/>
           </w:tcPr>
           <w:p>
@@ -1910,32 +1976,30 @@
         </w:trPr>
         <w:tc>
           <w:tcPr>
-            <w:tcW w:w="1650" w:type="dxa"/>
+            <w:tcW w:w="2689" w:type="dxa"/>
             <w:vAlign w:val="center"/>
           </w:tcPr>
           <w:p/>
         </w:tc>
         <w:tc>
           <w:tcPr>
-            <w:tcW w:w="1729" w:type="dxa"/>
-            <w:vAlign w:val="center"/>
-          </w:tcPr>
-          <w:p>
-            <w:r>
-              <w:t>Jan Bartalsky</w:t>
-            </w:r>
-          </w:p>
-        </w:tc>
-        <w:tc>
-          <w:tcPr>
-            <w:tcW w:w="4092" w:type="dxa"/>
-            <w:vAlign w:val="center"/>
-          </w:tcPr>
-          <w:p/>
-        </w:tc>
-        <w:tc>
-          <w:tcPr>
-            <w:tcW w:w="1880" w:type="dxa"/>
+            <w:tcW w:w="3402" w:type="dxa"/>
+            <w:vAlign w:val="center"/>
+          </w:tcPr>
+          <w:p>
+            <w:r>
+              <w:t xml:space="preserve">Jan </w:t>
+            </w:r>
+            <w:proofErr w:type="spellStart"/>
+            <w:r>
+              <w:t>Bartalsky</w:t>
+            </w:r>
+            <w:proofErr w:type="spellEnd"/>
+          </w:p>
+        </w:tc>
+        <w:tc>
+          <w:tcPr>
+            <w:tcW w:w="2693" w:type="dxa"/>
             <w:vAlign w:val="center"/>
           </w:tcPr>
           <w:p>
@@ -1951,14 +2015,14 @@
         </w:trPr>
         <w:tc>
           <w:tcPr>
-            <w:tcW w:w="1650" w:type="dxa"/>
+            <w:tcW w:w="2689" w:type="dxa"/>
             <w:vAlign w:val="center"/>
           </w:tcPr>
           <w:p/>
         </w:tc>
         <w:tc>
           <w:tcPr>
-            <w:tcW w:w="1729" w:type="dxa"/>
+            <w:tcW w:w="3402" w:type="dxa"/>
             <w:vAlign w:val="center"/>
           </w:tcPr>
           <w:p>
@@ -1969,14 +2033,7 @@
         </w:tc>
         <w:tc>
           <w:tcPr>
-            <w:tcW w:w="4092" w:type="dxa"/>
-            <w:vAlign w:val="center"/>
-          </w:tcPr>
-          <w:p/>
-        </w:tc>
-        <w:tc>
-          <w:tcPr>
-            <w:tcW w:w="1880" w:type="dxa"/>
+            <w:tcW w:w="2693" w:type="dxa"/>
             <w:vAlign w:val="center"/>
           </w:tcPr>
           <w:p>
@@ -1992,14 +2049,14 @@
         </w:trPr>
         <w:tc>
           <w:tcPr>
-            <w:tcW w:w="1650" w:type="dxa"/>
+            <w:tcW w:w="2689" w:type="dxa"/>
             <w:vAlign w:val="center"/>
           </w:tcPr>
           <w:p/>
         </w:tc>
         <w:tc>
           <w:tcPr>
-            <w:tcW w:w="1729" w:type="dxa"/>
+            <w:tcW w:w="3402" w:type="dxa"/>
             <w:vAlign w:val="center"/>
           </w:tcPr>
           <w:p>
@@ -2010,19 +2067,17 @@
         </w:tc>
         <w:tc>
           <w:tcPr>
-            <w:tcW w:w="4092" w:type="dxa"/>
-            <w:vAlign w:val="center"/>
-          </w:tcPr>
-          <w:p/>
-        </w:tc>
-        <w:tc>
-          <w:tcPr>
-            <w:tcW w:w="1880" w:type="dxa"/>
-            <w:vAlign w:val="center"/>
-          </w:tcPr>
-          <w:p>
-            <w:r>
-              <w:t>Cyber Guardians</w:t>
+            <w:tcW w:w="2693" w:type="dxa"/>
+            <w:vAlign w:val="center"/>
+          </w:tcPr>
+          <w:p>
+            <w:proofErr w:type="spellStart"/>
+            <w:r>
+              <w:t>Cyber</w:t>
+            </w:r>
+            <w:proofErr w:type="spellEnd"/>
+            <w:r>
+              <w:t xml:space="preserve"> Guardians</w:t>
             </w:r>
           </w:p>
         </w:tc>
@@ -2033,14 +2088,14 @@
         </w:trPr>
         <w:tc>
           <w:tcPr>
-            <w:tcW w:w="1650" w:type="dxa"/>
+            <w:tcW w:w="2689" w:type="dxa"/>
             <w:vAlign w:val="center"/>
           </w:tcPr>
           <w:p/>
         </w:tc>
         <w:tc>
           <w:tcPr>
-            <w:tcW w:w="1729" w:type="dxa"/>
+            <w:tcW w:w="3402" w:type="dxa"/>
             <w:vAlign w:val="center"/>
           </w:tcPr>
           <w:p>
@@ -2051,19 +2106,17 @@
         </w:tc>
         <w:tc>
           <w:tcPr>
-            <w:tcW w:w="4092" w:type="dxa"/>
-            <w:vAlign w:val="center"/>
-          </w:tcPr>
-          <w:p/>
-        </w:tc>
-        <w:tc>
-          <w:tcPr>
-            <w:tcW w:w="1880" w:type="dxa"/>
-            <w:vAlign w:val="center"/>
-          </w:tcPr>
-          <w:p>
-            <w:r>
-              <w:t>Cyber Guardians</w:t>
+            <w:tcW w:w="2693" w:type="dxa"/>
+            <w:vAlign w:val="center"/>
+          </w:tcPr>
+          <w:p>
+            <w:proofErr w:type="spellStart"/>
+            <w:r>
+              <w:t>Cyber</w:t>
+            </w:r>
+            <w:proofErr w:type="spellEnd"/>
+            <w:r>
+              <w:t xml:space="preserve"> Guardians</w:t>
             </w:r>
           </w:p>
         </w:tc>
@@ -2074,14 +2127,14 @@
         </w:trPr>
         <w:tc>
           <w:tcPr>
-            <w:tcW w:w="1650" w:type="dxa"/>
+            <w:tcW w:w="2689" w:type="dxa"/>
             <w:vAlign w:val="center"/>
           </w:tcPr>
           <w:p/>
         </w:tc>
         <w:tc>
           <w:tcPr>
-            <w:tcW w:w="1729" w:type="dxa"/>
+            <w:tcW w:w="3402" w:type="dxa"/>
             <w:vAlign w:val="center"/>
           </w:tcPr>
           <w:p>
@@ -2092,20 +2145,15 @@
         </w:tc>
         <w:tc>
           <w:tcPr>
-            <w:tcW w:w="4092" w:type="dxa"/>
-            <w:vAlign w:val="center"/>
-          </w:tcPr>
-          <w:p/>
-        </w:tc>
-        <w:tc>
-          <w:tcPr>
-            <w:tcW w:w="1880" w:type="dxa"/>
-            <w:vAlign w:val="center"/>
-          </w:tcPr>
-          <w:p>
+            <w:tcW w:w="2693" w:type="dxa"/>
+            <w:vAlign w:val="center"/>
+          </w:tcPr>
+          <w:p>
+            <w:proofErr w:type="spellStart"/>
             <w:r>
               <w:t>Absicherer</w:t>
             </w:r>
+            <w:proofErr w:type="spellEnd"/>
           </w:p>
         </w:tc>
       </w:tr>
@@ -2115,14 +2163,14 @@
         </w:trPr>
         <w:tc>
           <w:tcPr>
-            <w:tcW w:w="1650" w:type="dxa"/>
+            <w:tcW w:w="2689" w:type="dxa"/>
             <w:vAlign w:val="center"/>
           </w:tcPr>
           <w:p/>
         </w:tc>
         <w:tc>
           <w:tcPr>
-            <w:tcW w:w="1729" w:type="dxa"/>
+            <w:tcW w:w="3402" w:type="dxa"/>
             <w:vAlign w:val="center"/>
           </w:tcPr>
           <w:p>
@@ -2133,20 +2181,15 @@
         </w:tc>
         <w:tc>
           <w:tcPr>
-            <w:tcW w:w="4092" w:type="dxa"/>
-            <w:vAlign w:val="center"/>
-          </w:tcPr>
-          <w:p/>
-        </w:tc>
-        <w:tc>
-          <w:tcPr>
-            <w:tcW w:w="1880" w:type="dxa"/>
-            <w:vAlign w:val="center"/>
-          </w:tcPr>
-          <w:p>
+            <w:tcW w:w="2693" w:type="dxa"/>
+            <w:vAlign w:val="center"/>
+          </w:tcPr>
+          <w:p>
+            <w:proofErr w:type="spellStart"/>
             <w:r>
               <w:t>Absicherer</w:t>
             </w:r>
+            <w:proofErr w:type="spellEnd"/>
           </w:p>
         </w:tc>
       </w:tr>
@@ -2156,14 +2199,14 @@
         </w:trPr>
         <w:tc>
           <w:tcPr>
-            <w:tcW w:w="1650" w:type="dxa"/>
+            <w:tcW w:w="2689" w:type="dxa"/>
             <w:vAlign w:val="center"/>
           </w:tcPr>
           <w:p/>
         </w:tc>
         <w:tc>
           <w:tcPr>
-            <w:tcW w:w="1729" w:type="dxa"/>
+            <w:tcW w:w="3402" w:type="dxa"/>
             <w:vAlign w:val="center"/>
           </w:tcPr>
           <w:p>
@@ -2174,20 +2217,15 @@
         </w:tc>
         <w:tc>
           <w:tcPr>
-            <w:tcW w:w="4092" w:type="dxa"/>
-            <w:vAlign w:val="center"/>
-          </w:tcPr>
-          <w:p/>
-        </w:tc>
-        <w:tc>
-          <w:tcPr>
-            <w:tcW w:w="1880" w:type="dxa"/>
-            <w:vAlign w:val="center"/>
-          </w:tcPr>
-          <w:p>
+            <w:tcW w:w="2693" w:type="dxa"/>
+            <w:vAlign w:val="center"/>
+          </w:tcPr>
+          <w:p>
+            <w:proofErr w:type="spellStart"/>
             <w:r>
               <w:t>Absicherer</w:t>
             </w:r>
+            <w:proofErr w:type="spellEnd"/>
           </w:p>
         </w:tc>
       </w:tr>
@@ -2240,7 +2278,15 @@
           <w:b/>
           <w:bCs/>
         </w:rPr>
-        <w:t xml:space="preserve"> Anbieter</w:t>
+        <w:t xml:space="preserve"> </w:t>
+      </w:r>
+      <w:proofErr w:type="spellStart"/>
+      <w:r>
+        <w:rPr>
+          <w:b/>
+          <w:bCs/>
+        </w:rPr>
+        <w:t>Anbieter</w:t>
       </w:r>
       <w:r>
         <w:rPr>
@@ -2249,6 +2295,7 @@
         </w:rPr>
         <w:t>:innen</w:t>
       </w:r>
+      <w:proofErr w:type="spellEnd"/>
     </w:p>
     <w:p/>
     <w:p>
@@ -2261,7 +2308,35 @@
         <w:rPr>
           <w:color w:val="FF4554"/>
         </w:rPr>
-        <w:t>Darstellen, welche Ziele der oder die Anbieter:in des Produkts/der Software, die für das Unternehmen entwickelt werden soll, verfolgen. Auch wenn das Produkt letztendlich vom Endanwender genutzt wird, sollten die Ziele nicht vernachlässigt werden. Diese können die Anforderungen ebenso stark beeinflussen wie die Ziele der künftigen Anwender:innen.</w:t>
+        <w:t xml:space="preserve">Darstellen, welche Ziele der oder die </w:t>
+      </w:r>
+      <w:proofErr w:type="spellStart"/>
+      <w:r>
+        <w:rPr>
+          <w:color w:val="FF4554"/>
+        </w:rPr>
+        <w:t>Anbieter:in</w:t>
+      </w:r>
+      <w:proofErr w:type="spellEnd"/>
+      <w:r>
+        <w:rPr>
+          <w:color w:val="FF4554"/>
+        </w:rPr>
+        <w:t xml:space="preserve"> des Produkts/der Software, die für das Unternehmen entwickelt werden soll, verfolgen. Auch wenn das Produkt letztendlich vom Endanwender genutzt wird, sollten die Ziele nicht vernachlässigt werden. Diese können die Anforderungen ebenso stark beeinflussen wie die Ziele der künftigen </w:t>
+      </w:r>
+      <w:proofErr w:type="spellStart"/>
+      <w:r>
+        <w:rPr>
+          <w:color w:val="FF4554"/>
+        </w:rPr>
+        <w:t>Anwender:innen</w:t>
+      </w:r>
+      <w:proofErr w:type="spellEnd"/>
+      <w:r>
+        <w:rPr>
+          <w:color w:val="FF4554"/>
+        </w:rPr>
+        <w:t>.</w:t>
       </w:r>
     </w:p>
     <w:p>
@@ -2311,8 +2386,17 @@
           <w:b/>
           <w:bCs/>
         </w:rPr>
-        <w:t xml:space="preserve"> und Nutzen der Anwender:innen</w:t>
-      </w:r>
+        <w:t xml:space="preserve"> und Nutzen der </w:t>
+      </w:r>
+      <w:proofErr w:type="spellStart"/>
+      <w:r>
+        <w:rPr>
+          <w:b/>
+          <w:bCs/>
+        </w:rPr>
+        <w:t>Anwender:innen</w:t>
+      </w:r>
+      <w:proofErr w:type="spellEnd"/>
     </w:p>
     <w:p/>
     <w:p>
@@ -2325,8 +2409,21 @@
         <w:rPr>
           <w:color w:val="FF4554"/>
         </w:rPr>
-        <w:lastRenderedPageBreak/>
-        <w:t>An dieser Stelle werden nun auch die Ziele und der Nutzen der Anwender:innen dargestellt. Meist lassen sich diese Ziele v.a. in die funktionalen Anforderungen übersetzen.</w:t>
+        <w:t xml:space="preserve">An dieser Stelle werden nun auch die Ziele und der Nutzen der </w:t>
+      </w:r>
+      <w:proofErr w:type="spellStart"/>
+      <w:r>
+        <w:rPr>
+          <w:color w:val="FF4554"/>
+        </w:rPr>
+        <w:t>Anwender:innen</w:t>
+      </w:r>
+      <w:proofErr w:type="spellEnd"/>
+      <w:r>
+        <w:rPr>
+          <w:color w:val="FF4554"/>
+        </w:rPr>
+        <w:t xml:space="preserve"> dargestellt. Meist lassen sich diese Ziele v.a. in die funktionalen Anforderungen übersetzen.</w:t>
       </w:r>
     </w:p>
     <w:p/>
@@ -2356,7 +2453,35 @@
         <w:rPr>
           <w:color w:val="FF4554"/>
         </w:rPr>
-        <w:t>Definieren wer genau die Anwender:innen des Produkts sein sollen und wodurch sie sich auszeichnen. Auch hieraus können wichtige Anforderungen abgeleitet werden. Als vereinfachtes Beispiel könnte das Interface einer Software, die auch von Senior:innen genutzt werden soll, dementsprechend entworfen werden (z.B. sparsam eingesetzte, größere und auffälligere Buttons, die eindeutig auf die Funktion hindeuten, die sie auslösen).</w:t>
+        <w:t xml:space="preserve">Definieren wer genau die </w:t>
+      </w:r>
+      <w:proofErr w:type="spellStart"/>
+      <w:r>
+        <w:rPr>
+          <w:color w:val="FF4554"/>
+        </w:rPr>
+        <w:t>Anwender:innen</w:t>
+      </w:r>
+      <w:proofErr w:type="spellEnd"/>
+      <w:r>
+        <w:rPr>
+          <w:color w:val="FF4554"/>
+        </w:rPr>
+        <w:t xml:space="preserve"> des Produkts sein sollen und wodurch sie sich auszeichnen. Auch hieraus können wichtige Anforderungen abgeleitet werden. Als vereinfachtes Beispiel könnte das Interface einer Software, die auch von </w:t>
+      </w:r>
+      <w:proofErr w:type="spellStart"/>
+      <w:r>
+        <w:rPr>
+          <w:color w:val="FF4554"/>
+        </w:rPr>
+        <w:t>Senior:innen</w:t>
+      </w:r>
+      <w:proofErr w:type="spellEnd"/>
+      <w:r>
+        <w:rPr>
+          <w:color w:val="FF4554"/>
+        </w:rPr>
+        <w:t xml:space="preserve"> genutzt werden soll, dementsprechend entworfen werden (z.B. sparsam eingesetzte, größere und auffälligere Buttons, die eindeutig auf die Funktion hindeuten, die sie auslösen).</w:t>
       </w:r>
     </w:p>
     <w:p/>
@@ -2379,10 +2504,223 @@
         <w:t>4 Funktionale Anforderungen</w:t>
       </w:r>
     </w:p>
+    <w:p>
+      <w:pPr>
+        <w:rPr>
+          <w:b/>
+          <w:bCs/>
+        </w:rPr>
+      </w:pPr>
+      <w:r>
+        <w:rPr>
+          <w:b/>
+          <w:bCs/>
+        </w:rPr>
+        <w:t xml:space="preserve">4.1 </w:t>
+      </w:r>
+      <w:r>
+        <w:rPr>
+          <w:b/>
+          <w:bCs/>
+        </w:rPr>
+        <w:t>Primäre</w:t>
+      </w:r>
+      <w:r>
+        <w:rPr>
+          <w:b/>
+          <w:bCs/>
+        </w:rPr>
+        <w:t xml:space="preserve"> Anforderungen (Phase </w:t>
+      </w:r>
+      <w:r>
+        <w:rPr>
+          <w:b/>
+          <w:bCs/>
+        </w:rPr>
+        <w:t>1</w:t>
+      </w:r>
+      <w:r>
+        <w:rPr>
+          <w:b/>
+          <w:bCs/>
+        </w:rPr>
+        <w:t>)</w:t>
+      </w:r>
+    </w:p>
+    <w:p>
+      <w:r>
+        <w:t>Erfassung der Arbeitszeit (entweder als einfach Meldung „heute anwesend“ oder – je nach Mitarbeitereinstellung – mit Beginn- und Endzeit)</w:t>
+      </w:r>
+    </w:p>
+    <w:p>
+      <w:r>
+        <w:t>Zu jedem Zeiterfassungseintrag:</w:t>
+      </w:r>
+    </w:p>
+    <w:p>
+      <w:pPr>
+        <w:pStyle w:val="Listenabsatz"/>
+        <w:numPr>
+          <w:ilvl w:val="0"/>
+          <w:numId w:val="3"/>
+        </w:numPr>
+      </w:pPr>
+      <w:r>
+        <w:t>Verpflichtend: Speicherung der GPS-Daten</w:t>
+      </w:r>
+    </w:p>
+    <w:p>
+      <w:pPr>
+        <w:rPr>
+          <w:b/>
+          <w:bCs/>
+        </w:rPr>
+      </w:pPr>
+    </w:p>
+    <w:p>
+      <w:pPr>
+        <w:rPr>
+          <w:b/>
+          <w:bCs/>
+        </w:rPr>
+      </w:pPr>
+      <w:r>
+        <w:rPr>
+          <w:b/>
+          <w:bCs/>
+        </w:rPr>
+        <w:t>4.</w:t>
+      </w:r>
+      <w:r>
+        <w:rPr>
+          <w:b/>
+          <w:bCs/>
+        </w:rPr>
+        <w:t>2</w:t>
+      </w:r>
+      <w:r>
+        <w:rPr>
+          <w:b/>
+          <w:bCs/>
+        </w:rPr>
+        <w:t xml:space="preserve"> </w:t>
+      </w:r>
+      <w:r>
+        <w:rPr>
+          <w:b/>
+          <w:bCs/>
+        </w:rPr>
+        <w:t>Optionale Anforderungen</w:t>
+      </w:r>
+    </w:p>
+    <w:p>
+      <w:r>
+        <w:t>- Speicherung von Fotos</w:t>
+      </w:r>
+    </w:p>
+    <w:p>
+      <w:r>
+        <w:t xml:space="preserve">- Angabe eines </w:t>
+      </w:r>
+      <w:r>
+        <w:t>Reinigungsp</w:t>
+      </w:r>
+      <w:r>
+        <w:t>rojekts</w:t>
+      </w:r>
+    </w:p>
+    <w:p>
+      <w:r>
+        <w:t>- Eingabe einer Bemerkung</w:t>
+      </w:r>
+    </w:p>
     <w:p/>
     <w:p>
-      <w:r>
-        <w:t>Gewünschte Funktionalitäten einer Anwendung oder eines Produkts.</w:t>
+      <w:pPr>
+        <w:rPr>
+          <w:b/>
+          <w:bCs/>
+        </w:rPr>
+      </w:pPr>
+      <w:r>
+        <w:rPr>
+          <w:b/>
+          <w:bCs/>
+        </w:rPr>
+        <w:t>4.</w:t>
+      </w:r>
+      <w:r>
+        <w:rPr>
+          <w:b/>
+          <w:bCs/>
+        </w:rPr>
+        <w:t>3</w:t>
+      </w:r>
+      <w:r>
+        <w:rPr>
+          <w:b/>
+          <w:bCs/>
+        </w:rPr>
+        <w:t xml:space="preserve"> </w:t>
+      </w:r>
+      <w:r>
+        <w:rPr>
+          <w:b/>
+          <w:bCs/>
+        </w:rPr>
+        <w:t xml:space="preserve">Back-Office-Bereich </w:t>
+      </w:r>
+      <w:r>
+        <w:rPr>
+          <w:b/>
+          <w:bCs/>
+        </w:rPr>
+        <w:t>Anforderungen</w:t>
+      </w:r>
+      <w:r>
+        <w:rPr>
+          <w:b/>
+          <w:bCs/>
+        </w:rPr>
+        <w:t xml:space="preserve"> </w:t>
+      </w:r>
+      <w:r>
+        <w:rPr>
+          <w:b/>
+          <w:bCs/>
+        </w:rPr>
+        <w:t>(Phase 2)</w:t>
+      </w:r>
+    </w:p>
+    <w:p>
+      <w:r>
+        <w:t>Berechti</w:t>
+      </w:r>
+      <w:r>
+        <w:t>gte</w:t>
+      </w:r>
+      <w:r>
+        <w:t xml:space="preserve"> Mitarbeiter de</w:t>
+      </w:r>
+      <w:r>
+        <w:t xml:space="preserve">s AG </w:t>
+      </w:r>
+      <w:r>
+        <w:t>müssen Arbeitszeiten der Reinigungskräfte einsehen können.</w:t>
+      </w:r>
+    </w:p>
+    <w:p>
+      <w:r>
+        <w:t xml:space="preserve">Berechtige Mitarbeiter </w:t>
+      </w:r>
+      <w:r>
+        <w:t>der KUs</w:t>
+      </w:r>
+      <w:r>
+        <w:t xml:space="preserve"> müssen Daten einsehen können</w:t>
+      </w:r>
+      <w:r>
+        <w:t>, die sich auf den KU beziehen.</w:t>
       </w:r>
     </w:p>
     <w:p/>
@@ -2398,7 +2736,28 @@
           <w:b/>
           <w:bCs/>
         </w:rPr>
-        <w:t>4.1 Anforderung 1</w:t>
+        <w:t>4.</w:t>
+      </w:r>
+      <w:r>
+        <w:rPr>
+          <w:b/>
+          <w:bCs/>
+        </w:rPr>
+        <w:t>4</w:t>
+      </w:r>
+      <w:r>
+        <w:rPr>
+          <w:b/>
+          <w:bCs/>
+        </w:rPr>
+        <w:t xml:space="preserve"> </w:t>
+      </w:r>
+      <w:r>
+        <w:rPr>
+          <w:b/>
+          <w:bCs/>
+        </w:rPr>
+        <w:t>Bonus Anforderungen</w:t>
       </w:r>
     </w:p>
     <w:p/>
@@ -2415,119 +2774,73 @@
         <w:t>XXX</w:t>
       </w:r>
     </w:p>
+    <w:p>
+      <w:pPr>
+        <w:rPr>
+          <w:b/>
+          <w:bCs/>
+        </w:rPr>
+      </w:pPr>
+      <w:r>
+        <w:rPr>
+          <w:b/>
+          <w:bCs/>
+        </w:rPr>
+        <w:br w:type="page"/>
+      </w:r>
+    </w:p>
+    <w:p>
+      <w:pPr>
+        <w:rPr>
+          <w:b/>
+          <w:bCs/>
+        </w:rPr>
+      </w:pPr>
+      <w:r>
+        <w:rPr>
+          <w:b/>
+          <w:bCs/>
+        </w:rPr>
+        <w:lastRenderedPageBreak/>
+        <w:t>5 Nichtfunktionale Anforderungen</w:t>
+      </w:r>
+    </w:p>
     <w:p/>
     <w:p>
-      <w:pPr>
-        <w:rPr>
-          <w:b/>
-          <w:bCs/>
-        </w:rPr>
-      </w:pPr>
-      <w:r>
-        <w:rPr>
-          <w:b/>
-          <w:bCs/>
-        </w:rPr>
-        <w:t>4.2 Anforderung 2</w:t>
+      <w:r>
+        <w:t xml:space="preserve">Anforderungen an die Qualität, das Design oder </w:t>
+      </w:r>
+      <w:r>
+        <w:t>Gesetze und Vorschriften.</w:t>
       </w:r>
     </w:p>
     <w:p/>
     <w:p>
       <w:pPr>
         <w:rPr>
-          <w:color w:val="FF4554"/>
-        </w:rPr>
-      </w:pPr>
-      <w:r>
-        <w:rPr>
-          <w:color w:val="FF4554"/>
-        </w:rPr>
-        <w:t>XXX</w:t>
+          <w:b/>
+          <w:bCs/>
+        </w:rPr>
+      </w:pPr>
+      <w:r>
+        <w:rPr>
+          <w:b/>
+          <w:bCs/>
+        </w:rPr>
+        <w:t>5.1 Allgemeine Anforderungen</w:t>
       </w:r>
     </w:p>
     <w:p/>
     <w:p>
       <w:pPr>
         <w:rPr>
-          <w:b/>
-          <w:bCs/>
-        </w:rPr>
-      </w:pPr>
-      <w:r>
-        <w:rPr>
-          <w:b/>
-          <w:bCs/>
-        </w:rPr>
-        <w:t>4.3 Anforderung 3</w:t>
-      </w:r>
-    </w:p>
-    <w:p/>
-    <w:p>
-      <w:pPr>
-        <w:rPr>
-          <w:color w:val="FF4554"/>
-        </w:rPr>
-      </w:pPr>
-      <w:r>
-        <w:rPr>
-          <w:color w:val="FF4554"/>
-        </w:rPr>
-        <w:t>XXX</w:t>
-      </w:r>
-    </w:p>
-    <w:p/>
-    <w:p>
-      <w:pPr>
-        <w:rPr>
-          <w:b/>
-          <w:bCs/>
-        </w:rPr>
-      </w:pPr>
-      <w:r>
-        <w:rPr>
-          <w:b/>
-          <w:bCs/>
-        </w:rPr>
-        <w:t>5 Nichtfunktionale Anforderungen</w:t>
-      </w:r>
-    </w:p>
-    <w:p/>
-    <w:p>
-      <w:r>
-        <w:t xml:space="preserve">Anforderungen an die Qualität, das Design oder </w:t>
-      </w:r>
-      <w:r>
-        <w:t>Gesetze und Vorschriften.</w:t>
-      </w:r>
-    </w:p>
-    <w:p/>
-    <w:p>
-      <w:pPr>
-        <w:rPr>
-          <w:b/>
-          <w:bCs/>
-        </w:rPr>
-      </w:pPr>
-      <w:r>
-        <w:rPr>
-          <w:b/>
-          <w:bCs/>
-        </w:rPr>
-        <w:t>5.1 Allgemeine Anforderungen</w:t>
-      </w:r>
-    </w:p>
-    <w:p/>
-    <w:p>
-      <w:pPr>
-        <w:rPr>
-          <w:color w:val="FF4554"/>
-        </w:rPr>
-      </w:pPr>
-      <w:r>
-        <w:rPr>
-          <w:color w:val="FF4554"/>
-        </w:rPr>
-        <w:lastRenderedPageBreak/>
+          <w:color w:val="FF4554"/>
+        </w:rPr>
+      </w:pPr>
+      <w:r>
+        <w:rPr>
+          <w:color w:val="FF4554"/>
+        </w:rPr>
         <w:t>XXX</w:t>
       </w:r>
     </w:p>
@@ -2658,54 +2971,160 @@
         <w:t>Rahmenbedingungen</w:t>
       </w:r>
     </w:p>
+    <w:p>
+      <w:r>
+        <w:rPr>
+          <w:b/>
+          <w:bCs/>
+        </w:rPr>
+        <w:t>Phase 1</w:t>
+      </w:r>
+      <w:r>
+        <w:t xml:space="preserve">: Mobile Webanwendung,  die RK die Zeiterfassung via </w:t>
+      </w:r>
+      <w:r>
+        <w:t>Smartphone</w:t>
+      </w:r>
+      <w:r>
+        <w:t xml:space="preserve"> ermöglicht.</w:t>
+      </w:r>
+    </w:p>
+    <w:p>
+      <w:r>
+        <w:t>Erforderlich:</w:t>
+      </w:r>
+    </w:p>
+    <w:p>
+      <w:pPr>
+        <w:pStyle w:val="Listenabsatz"/>
+        <w:numPr>
+          <w:ilvl w:val="0"/>
+          <w:numId w:val="3"/>
+        </w:numPr>
+      </w:pPr>
+      <w:r>
+        <w:t>Erfassung der Arbeitszeit</w:t>
+      </w:r>
+    </w:p>
+    <w:p>
+      <w:pPr>
+        <w:pStyle w:val="Listenabsatz"/>
+        <w:numPr>
+          <w:ilvl w:val="0"/>
+          <w:numId w:val="3"/>
+        </w:numPr>
+      </w:pPr>
+      <w:r>
+        <w:t>Speicherung der GPS-Koordinaten</w:t>
+      </w:r>
+    </w:p>
+    <w:p>
+      <w:r>
+        <w:t>Optional:</w:t>
+      </w:r>
+    </w:p>
+    <w:p>
+      <w:pPr>
+        <w:pStyle w:val="Listenabsatz"/>
+        <w:numPr>
+          <w:ilvl w:val="0"/>
+          <w:numId w:val="3"/>
+        </w:numPr>
+      </w:pPr>
+      <w:r>
+        <w:t>Speicherung von Fotos</w:t>
+      </w:r>
+    </w:p>
+    <w:p>
+      <w:pPr>
+        <w:pStyle w:val="Listenabsatz"/>
+        <w:numPr>
+          <w:ilvl w:val="0"/>
+          <w:numId w:val="3"/>
+        </w:numPr>
+      </w:pPr>
+      <w:r>
+        <w:t>Angabe des Projekts</w:t>
+      </w:r>
+    </w:p>
+    <w:p>
+      <w:pPr>
+        <w:pStyle w:val="Listenabsatz"/>
+        <w:numPr>
+          <w:ilvl w:val="0"/>
+          <w:numId w:val="3"/>
+        </w:numPr>
+      </w:pPr>
+      <w:r>
+        <w:t>Eingabe einer Bemerkung</w:t>
+      </w:r>
+    </w:p>
+    <w:p>
+      <w:r>
+        <w:rPr>
+          <w:b/>
+          <w:bCs/>
+        </w:rPr>
+        <w:t>Phase 2</w:t>
+      </w:r>
+      <w:r>
+        <w:t>: Mobile Webanwendung, die MA von AG und KU erlaubt relevante Daten einzusehen.</w:t>
+      </w:r>
+    </w:p>
+    <w:p>
+      <w:r>
+        <w:t>- Berechtigte MA des AG müssen Arbeitszeiten der RK einsehen können</w:t>
+      </w:r>
+    </w:p>
+    <w:p>
+      <w:r>
+        <w:t xml:space="preserve">- Berechtigte MA </w:t>
+      </w:r>
+      <w:r>
+        <w:t>des KU müssen Arbeitszeiten der RK die KU betreffen einsehen können</w:t>
+      </w:r>
+    </w:p>
+    <w:p>
+      <w:pPr>
+        <w:rPr>
+          <w:b/>
+          <w:bCs/>
+          <w:color w:val="FF0000"/>
+        </w:rPr>
+      </w:pPr>
+      <w:r>
+        <w:rPr>
+          <w:b/>
+          <w:bCs/>
+          <w:color w:val="FF0000"/>
+        </w:rPr>
+        <w:lastRenderedPageBreak/>
+        <w:t xml:space="preserve">6.1 </w:t>
+      </w:r>
+      <w:r>
+        <w:rPr>
+          <w:b/>
+          <w:bCs/>
+          <w:color w:val="FF0000"/>
+        </w:rPr>
+        <w:t>Zeitplan</w:t>
+      </w:r>
+    </w:p>
+    <w:p>
+      <w:r>
+        <w:t xml:space="preserve">Projekt fertig bis Ende Praxislabor: </w:t>
+      </w:r>
+      <w:r>
+        <w:t xml:space="preserve"> (Datum folgt)</w:t>
+      </w:r>
+    </w:p>
+    <w:p>
+      <w:r>
+        <w:t>Meilensteile: (Daten folgen)</w:t>
+      </w:r>
+    </w:p>
     <w:p/>
     <w:p>
-      <w:r>
-        <w:t xml:space="preserve">So genau wie möglich festhalten, was </w:t>
-      </w:r>
-      <w:r>
-        <w:t>zu welchem Zeitpunkt geliefert werden soll.</w:t>
-      </w:r>
-    </w:p>
-    <w:p/>
-    <w:p>
-      <w:pPr>
-        <w:rPr>
-          <w:b/>
-          <w:bCs/>
-        </w:rPr>
-      </w:pPr>
-      <w:r>
-        <w:rPr>
-          <w:b/>
-          <w:bCs/>
-        </w:rPr>
-        <w:t xml:space="preserve">6.1 </w:t>
-      </w:r>
-      <w:r>
-        <w:rPr>
-          <w:b/>
-          <w:bCs/>
-        </w:rPr>
-        <w:t>Zeitplan</w:t>
-      </w:r>
-    </w:p>
-    <w:p/>
-    <w:p>
-      <w:pPr>
-        <w:rPr>
-          <w:color w:val="FF4554"/>
-        </w:rPr>
-      </w:pPr>
-      <w:r>
-        <w:rPr>
-          <w:color w:val="FF4554"/>
-        </w:rPr>
-        <w:t>Wie lange dauern die einzelnen Phasen des Projekts ungefähr? Eine Übersicht mit Arbeitszeiten bietet sich hier an.</w:t>
-      </w:r>
-    </w:p>
-    <w:p/>
-    <w:p>
       <w:pPr>
         <w:rPr>
           <w:b/>
@@ -2727,18 +3146,69 @@
         <w:t>Technische Anforderungen</w:t>
       </w:r>
     </w:p>
-    <w:p/>
-    <w:p>
-      <w:pPr>
-        <w:rPr>
-          <w:color w:val="FF4554"/>
-        </w:rPr>
-      </w:pPr>
-      <w:r>
-        <w:rPr>
-          <w:color w:val="FF4554"/>
-        </w:rPr>
-        <w:t>Was wird für die Umsetzung des Projekts benötigt? Eine Auflistung von Hardware, Software, Werkzeug oder Equipment bietet sich hier an.</w:t>
+    <w:p>
+      <w:pPr>
+        <w:rPr>
+          <w:color w:val="FF4554"/>
+        </w:rPr>
+      </w:pPr>
+      <w:r>
+        <w:rPr>
+          <w:color w:val="FF4554"/>
+        </w:rPr>
+        <w:t>Datenbank</w:t>
+      </w:r>
+    </w:p>
+    <w:p>
+      <w:pPr>
+        <w:rPr>
+          <w:color w:val="FF4554"/>
+        </w:rPr>
+      </w:pPr>
+      <w:r>
+        <w:rPr>
+          <w:color w:val="FF4554"/>
+        </w:rPr>
+        <w:t>Backend</w:t>
+      </w:r>
+    </w:p>
+    <w:p>
+      <w:pPr>
+        <w:rPr>
+          <w:color w:val="FF4554"/>
+        </w:rPr>
+      </w:pPr>
+      <w:r>
+        <w:rPr>
+          <w:color w:val="FF4554"/>
+        </w:rPr>
+        <w:t>Frontend</w:t>
+      </w:r>
+    </w:p>
+    <w:p>
+      <w:pPr>
+        <w:rPr>
+          <w:color w:val="FF4554"/>
+        </w:rPr>
+      </w:pPr>
+      <w:r>
+        <w:rPr>
+          <w:color w:val="FF4554"/>
+        </w:rPr>
+        <w:t>Schnittstellen</w:t>
+      </w:r>
+    </w:p>
+    <w:p>
+      <w:pPr>
+        <w:rPr>
+          <w:color w:val="FF4554"/>
+        </w:rPr>
+      </w:pPr>
+      <w:r>
+        <w:rPr>
+          <w:color w:val="FF4554"/>
+        </w:rPr>
+        <w:t>Sicherheit</w:t>
       </w:r>
     </w:p>
     <w:p/>
@@ -2921,13 +3391,6 @@
         </w:rPr>
         <w:t>Alle Dokumente, Zahlen, Fakten, Unterlagen etc. die als Hintergrund zum Projekt dienen.</w:t>
       </w:r>
-    </w:p>
-    <w:p>
-      <w:pPr>
-        <w:rPr>
-          <w:color w:val="ED7D31" w:themeColor="accent2"/>
-        </w:rPr>
-      </w:pPr>
     </w:p>
     <w:sectPr>
       <w:footerReference w:type="default" r:id="rId11"/>
@@ -3439,6 +3902,119 @@
 <file path=word/numbering.xml><?xml version="1.0" encoding="utf-8"?>
 <w:numbering xmlns:wpc="http://schemas.microsoft.com/office/word/2010/wordprocessingCanvas" xmlns:cx="http://schemas.microsoft.com/office/drawing/2014/chartex" xmlns:cx1="http://schemas.microsoft.com/office/drawing/2015/9/8/chartex" xmlns:cx2="http://schemas.microsoft.com/office/drawing/2015/10/21/chartex" xmlns:cx3="http://schemas.microsoft.com/office/drawing/2016/5/9/chartex" xmlns:cx4="http://schemas.microsoft.com/office/drawing/2016/5/10/chartex" xmlns:cx5="http://schemas.microsoft.com/office/drawing/2016/5/11/chartex" xmlns:cx6="http://schemas.microsoft.com/office/drawing/2016/5/12/chartex" xmlns:cx7="http://schemas.microsoft.com/office/drawing/2016/5/13/chartex" xmlns:cx8="http://schemas.microsoft.com/office/drawing/2016/5/14/chartex" xmlns:mc="http://schemas.openxmlformats.org/markup-compatibility/2006" xmlns:aink="http://schemas.microsoft.com/office/drawing/2016/ink" xmlns:am3d="http://schemas.microsoft.com/office/drawing/2017/model3d" xmlns:o="urn:schemas-microsoft-com:office:office" xmlns:oel="http://schemas.microsoft.com/office/2019/extlst" xmlns:r="http://schemas.openxmlformats.org/officeDocument/2006/relationships" xmlns:m="http://schemas.openxmlformats.org/officeDocument/2006/math" xmlns:v="urn:schemas-microsoft-com:vml" xmlns:wp14="http://schemas.microsoft.com/office/word/2010/wordprocessingDrawing" xmlns:wp="http://schemas.openxmlformats.org/drawingml/2006/wordprocessingDrawing" xmlns:w10="urn:schemas-microsoft-com:office:word" xmlns:w="http://schemas.openxmlformats.org/wordprocessingml/2006/main" xmlns:w14="http://schemas.microsoft.com/office/word/2010/wordml" xmlns:w15="http://schemas.microsoft.com/office/word/2012/wordml" xmlns:w16cex="http://schemas.microsoft.com/office/word/2018/wordml/cex" xmlns:w16cid="http://schemas.microsoft.com/office/word/2016/wordml/cid" xmlns:w16="http://schemas.microsoft.com/office/word/2018/wordml" xmlns:w16du="http://schemas.microsoft.com/office/word/2023/wordml/word16du" xmlns:w16sdtdh="http://schemas.microsoft.com/office/word/2020/wordml/sdtdatahash" xmlns:w16sdtfl="http://schemas.microsoft.com/office/word/2024/wordml/sdtformatlock" xmlns:w16se="http://schemas.microsoft.com/office/word/2015/wordml/symex" xmlns:wpg="http://schemas.microsoft.com/office/word/2010/wordprocessingGroup" xmlns:wpi="http://schemas.microsoft.com/office/word/2010/wordprocessingInk" xmlns:wne="http://schemas.microsoft.com/office/word/2006/wordml" xmlns:wps="http://schemas.microsoft.com/office/word/2010/wordprocessingShape" mc:Ignorable="w14 w15 w16se w16cid w16 w16cex w16sdtdh w16sdtfl w16du wp14">
   <w:abstractNum w:abstractNumId="0" w15:restartNumberingAfterBreak="0">
+    <w:nsid w:val="4A584B08"/>
+    <w:multiLevelType w:val="hybridMultilevel"/>
+    <w:tmpl w:val="2604F0B2"/>
+    <w:lvl w:ilvl="0" w:tplc="35C670FE">
+      <w:start w:val="4"/>
+      <w:numFmt w:val="bullet"/>
+      <w:lvlText w:val="-"/>
+      <w:lvlJc w:val="left"/>
+      <w:pPr>
+        <w:ind w:left="1068" w:hanging="360"/>
+      </w:pPr>
+      <w:rPr>
+        <w:rFonts w:ascii="Calibri" w:eastAsiaTheme="minorHAnsi" w:hAnsi="Calibri" w:cs="Calibri" w:hint="default"/>
+      </w:rPr>
+    </w:lvl>
+    <w:lvl w:ilvl="1" w:tplc="0C070003" w:tentative="1">
+      <w:start w:val="1"/>
+      <w:numFmt w:val="bullet"/>
+      <w:lvlText w:val="o"/>
+      <w:lvlJc w:val="left"/>
+      <w:pPr>
+        <w:ind w:left="1788" w:hanging="360"/>
+      </w:pPr>
+      <w:rPr>
+        <w:rFonts w:ascii="Courier New" w:hAnsi="Courier New" w:cs="Courier New" w:hint="default"/>
+      </w:rPr>
+    </w:lvl>
+    <w:lvl w:ilvl="2" w:tplc="0C070005" w:tentative="1">
+      <w:start w:val="1"/>
+      <w:numFmt w:val="bullet"/>
+      <w:lvlText w:val=""/>
+      <w:lvlJc w:val="left"/>
+      <w:pPr>
+        <w:ind w:left="2508" w:hanging="360"/>
+      </w:pPr>
+      <w:rPr>
+        <w:rFonts w:ascii="Wingdings" w:hAnsi="Wingdings" w:hint="default"/>
+      </w:rPr>
+    </w:lvl>
+    <w:lvl w:ilvl="3" w:tplc="0C070001" w:tentative="1">
+      <w:start w:val="1"/>
+      <w:numFmt w:val="bullet"/>
+      <w:lvlText w:val=""/>
+      <w:lvlJc w:val="left"/>
+      <w:pPr>
+        <w:ind w:left="3228" w:hanging="360"/>
+      </w:pPr>
+      <w:rPr>
+        <w:rFonts w:ascii="Symbol" w:hAnsi="Symbol" w:hint="default"/>
+      </w:rPr>
+    </w:lvl>
+    <w:lvl w:ilvl="4" w:tplc="0C070003" w:tentative="1">
+      <w:start w:val="1"/>
+      <w:numFmt w:val="bullet"/>
+      <w:lvlText w:val="o"/>
+      <w:lvlJc w:val="left"/>
+      <w:pPr>
+        <w:ind w:left="3948" w:hanging="360"/>
+      </w:pPr>
+      <w:rPr>
+        <w:rFonts w:ascii="Courier New" w:hAnsi="Courier New" w:cs="Courier New" w:hint="default"/>
+      </w:rPr>
+    </w:lvl>
+    <w:lvl w:ilvl="5" w:tplc="0C070005" w:tentative="1">
+      <w:start w:val="1"/>
+      <w:numFmt w:val="bullet"/>
+      <w:lvlText w:val=""/>
+      <w:lvlJc w:val="left"/>
+      <w:pPr>
+        <w:ind w:left="4668" w:hanging="360"/>
+      </w:pPr>
+      <w:rPr>
+        <w:rFonts w:ascii="Wingdings" w:hAnsi="Wingdings" w:hint="default"/>
+      </w:rPr>
+    </w:lvl>
+    <w:lvl w:ilvl="6" w:tplc="0C070001" w:tentative="1">
+      <w:start w:val="1"/>
+      <w:numFmt w:val="bullet"/>
+      <w:lvlText w:val=""/>
+      <w:lvlJc w:val="left"/>
+      <w:pPr>
+        <w:ind w:left="5388" w:hanging="360"/>
+      </w:pPr>
+      <w:rPr>
+        <w:rFonts w:ascii="Symbol" w:hAnsi="Symbol" w:hint="default"/>
+      </w:rPr>
+    </w:lvl>
+    <w:lvl w:ilvl="7" w:tplc="0C070003" w:tentative="1">
+      <w:start w:val="1"/>
+      <w:numFmt w:val="bullet"/>
+      <w:lvlText w:val="o"/>
+      <w:lvlJc w:val="left"/>
+      <w:pPr>
+        <w:ind w:left="6108" w:hanging="360"/>
+      </w:pPr>
+      <w:rPr>
+        <w:rFonts w:ascii="Courier New" w:hAnsi="Courier New" w:cs="Courier New" w:hint="default"/>
+      </w:rPr>
+    </w:lvl>
+    <w:lvl w:ilvl="8" w:tplc="0C070005" w:tentative="1">
+      <w:start w:val="1"/>
+      <w:numFmt w:val="bullet"/>
+      <w:lvlText w:val=""/>
+      <w:lvlJc w:val="left"/>
+      <w:pPr>
+        <w:ind w:left="6828" w:hanging="360"/>
+      </w:pPr>
+      <w:rPr>
+        <w:rFonts w:ascii="Wingdings" w:hAnsi="Wingdings" w:hint="default"/>
+      </w:rPr>
+    </w:lvl>
+  </w:abstractNum>
+  <w:abstractNum w:abstractNumId="1" w15:restartNumberingAfterBreak="0">
     <w:nsid w:val="69EA0073"/>
     <w:multiLevelType w:val="hybridMultilevel"/>
     <w:tmpl w:val="BBF060AC"/>
@@ -3551,8 +4127,127 @@
       </w:rPr>
     </w:lvl>
   </w:abstractNum>
+  <w:abstractNum w:abstractNumId="2" w15:restartNumberingAfterBreak="0">
+    <w:nsid w:val="6D3E36F8"/>
+    <w:multiLevelType w:val="hybridMultilevel"/>
+    <w:tmpl w:val="DBA8783E"/>
+    <w:lvl w:ilvl="0" w:tplc="6B9E2AF8">
+      <w:start w:val="4"/>
+      <w:numFmt w:val="bullet"/>
+      <w:lvlText w:val="-"/>
+      <w:lvlJc w:val="left"/>
+      <w:pPr>
+        <w:ind w:left="720" w:hanging="360"/>
+      </w:pPr>
+      <w:rPr>
+        <w:rFonts w:ascii="Calibri" w:eastAsiaTheme="minorHAnsi" w:hAnsi="Calibri" w:cs="Calibri" w:hint="default"/>
+      </w:rPr>
+    </w:lvl>
+    <w:lvl w:ilvl="1" w:tplc="0C070003" w:tentative="1">
+      <w:start w:val="1"/>
+      <w:numFmt w:val="bullet"/>
+      <w:lvlText w:val="o"/>
+      <w:lvlJc w:val="left"/>
+      <w:pPr>
+        <w:ind w:left="1440" w:hanging="360"/>
+      </w:pPr>
+      <w:rPr>
+        <w:rFonts w:ascii="Courier New" w:hAnsi="Courier New" w:cs="Courier New" w:hint="default"/>
+      </w:rPr>
+    </w:lvl>
+    <w:lvl w:ilvl="2" w:tplc="0C070005" w:tentative="1">
+      <w:start w:val="1"/>
+      <w:numFmt w:val="bullet"/>
+      <w:lvlText w:val=""/>
+      <w:lvlJc w:val="left"/>
+      <w:pPr>
+        <w:ind w:left="2160" w:hanging="360"/>
+      </w:pPr>
+      <w:rPr>
+        <w:rFonts w:ascii="Wingdings" w:hAnsi="Wingdings" w:hint="default"/>
+      </w:rPr>
+    </w:lvl>
+    <w:lvl w:ilvl="3" w:tplc="0C070001" w:tentative="1">
+      <w:start w:val="1"/>
+      <w:numFmt w:val="bullet"/>
+      <w:lvlText w:val=""/>
+      <w:lvlJc w:val="left"/>
+      <w:pPr>
+        <w:ind w:left="2880" w:hanging="360"/>
+      </w:pPr>
+      <w:rPr>
+        <w:rFonts w:ascii="Symbol" w:hAnsi="Symbol" w:hint="default"/>
+      </w:rPr>
+    </w:lvl>
+    <w:lvl w:ilvl="4" w:tplc="0C070003" w:tentative="1">
+      <w:start w:val="1"/>
+      <w:numFmt w:val="bullet"/>
+      <w:lvlText w:val="o"/>
+      <w:lvlJc w:val="left"/>
+      <w:pPr>
+        <w:ind w:left="3600" w:hanging="360"/>
+      </w:pPr>
+      <w:rPr>
+        <w:rFonts w:ascii="Courier New" w:hAnsi="Courier New" w:cs="Courier New" w:hint="default"/>
+      </w:rPr>
+    </w:lvl>
+    <w:lvl w:ilvl="5" w:tplc="0C070005" w:tentative="1">
+      <w:start w:val="1"/>
+      <w:numFmt w:val="bullet"/>
+      <w:lvlText w:val=""/>
+      <w:lvlJc w:val="left"/>
+      <w:pPr>
+        <w:ind w:left="4320" w:hanging="360"/>
+      </w:pPr>
+      <w:rPr>
+        <w:rFonts w:ascii="Wingdings" w:hAnsi="Wingdings" w:hint="default"/>
+      </w:rPr>
+    </w:lvl>
+    <w:lvl w:ilvl="6" w:tplc="0C070001" w:tentative="1">
+      <w:start w:val="1"/>
+      <w:numFmt w:val="bullet"/>
+      <w:lvlText w:val=""/>
+      <w:lvlJc w:val="left"/>
+      <w:pPr>
+        <w:ind w:left="5040" w:hanging="360"/>
+      </w:pPr>
+      <w:rPr>
+        <w:rFonts w:ascii="Symbol" w:hAnsi="Symbol" w:hint="default"/>
+      </w:rPr>
+    </w:lvl>
+    <w:lvl w:ilvl="7" w:tplc="0C070003" w:tentative="1">
+      <w:start w:val="1"/>
+      <w:numFmt w:val="bullet"/>
+      <w:lvlText w:val="o"/>
+      <w:lvlJc w:val="left"/>
+      <w:pPr>
+        <w:ind w:left="5760" w:hanging="360"/>
+      </w:pPr>
+      <w:rPr>
+        <w:rFonts w:ascii="Courier New" w:hAnsi="Courier New" w:cs="Courier New" w:hint="default"/>
+      </w:rPr>
+    </w:lvl>
+    <w:lvl w:ilvl="8" w:tplc="0C070005" w:tentative="1">
+      <w:start w:val="1"/>
+      <w:numFmt w:val="bullet"/>
+      <w:lvlText w:val=""/>
+      <w:lvlJc w:val="left"/>
+      <w:pPr>
+        <w:ind w:left="6480" w:hanging="360"/>
+      </w:pPr>
+      <w:rPr>
+        <w:rFonts w:ascii="Wingdings" w:hAnsi="Wingdings" w:hint="default"/>
+      </w:rPr>
+    </w:lvl>
+  </w:abstractNum>
   <w:num w:numId="1" w16cid:durableId="2044742092">
+    <w:abstractNumId w:val="1"/>
+  </w:num>
+  <w:num w:numId="2" w16cid:durableId="1275014243">
     <w:abstractNumId w:val="0"/>
+  </w:num>
+  <w:num w:numId="3" w16cid:durableId="27727700">
+    <w:abstractNumId w:val="2"/>
   </w:num>
 </w:numbering>
 </file>
@@ -4165,6 +4860,17 @@
       <w:shd w:val="clear" w:color="auto" w:fill="E1DFDD"/>
     </w:rPr>
   </w:style>
+  <w:style w:type="paragraph" w:styleId="Listenabsatz">
+    <w:name w:val="List Paragraph"/>
+    <w:basedOn w:val="Standard"/>
+    <w:uiPriority w:val="34"/>
+    <w:qFormat/>
+    <w:rsid w:val="003C4022"/>
+    <w:pPr>
+      <w:ind w:left="720"/>
+      <w:contextualSpacing/>
+    </w:pPr>
+  </w:style>
 </w:styles>
 </file>
 
@@ -4464,6 +5170,23 @@
 </file>
 
 <file path=customXml/item1.xml><?xml version="1.0" encoding="utf-8"?>
+<b:Sources xmlns:b="http://schemas.openxmlformats.org/officeDocument/2006/bibliography" xmlns="http://schemas.openxmlformats.org/officeDocument/2006/bibliography" SelectedStyle="\APASixthEditionOfficeOnline.xsl" StyleName="APA" Version="6"/>
+</file>
+
+<file path=customXml/item2.xml><?xml version="1.0" encoding="utf-8"?>
+<p:properties xmlns:p="http://schemas.microsoft.com/office/2006/metadata/properties" xmlns:xsi="http://www.w3.org/2001/XMLSchema-instance" xmlns:pc="http://schemas.microsoft.com/office/infopath/2007/PartnerControls">
+  <documentManagement>
+    <lcf76f155ced4ddcb4097134ff3c332f xmlns="d8713921-ea06-4982-babe-663e602d233a">
+      <Terms xmlns="http://schemas.microsoft.com/office/infopath/2007/PartnerControls"/>
+    </lcf76f155ced4ddcb4097134ff3c332f>
+    <TaxCatchAll xmlns="8cf8b716-41e7-4309-ade8-e958aed37dc5" xsi:nil="true"/>
+    <_ip_UnifiedCompliancePolicyUIAction xmlns="http://schemas.microsoft.com/sharepoint/v3" xsi:nil="true"/>
+    <_ip_UnifiedCompliancePolicyProperties xmlns="http://schemas.microsoft.com/sharepoint/v3" xsi:nil="true"/>
+  </documentManagement>
+</p:properties>
+</file>
+
+<file path=customXml/item3.xml><?xml version="1.0" encoding="utf-8"?>
 <ct:contentTypeSchema xmlns:ct="http://schemas.microsoft.com/office/2006/metadata/contentType" xmlns:ma="http://schemas.microsoft.com/office/2006/metadata/properties/metaAttributes" ct:_="" ma:_="" ma:contentTypeName="Document" ma:contentTypeID="0x010100B2B2414F51209C4889A77C83DFC13516" ma:contentTypeVersion="22" ma:contentTypeDescription="Create a new document." ma:contentTypeScope="" ma:versionID="f2557d2f29a3839f6092d2cfd553b44b">
   <xsd:schema xmlns:xsd="http://www.w3.org/2001/XMLSchema" xmlns:xs="http://www.w3.org/2001/XMLSchema" xmlns:p="http://schemas.microsoft.com/office/2006/metadata/properties" xmlns:ns1="http://schemas.microsoft.com/sharepoint/v3" xmlns:ns2="d8713921-ea06-4982-babe-663e602d233a" xmlns:ns3="8cf8b716-41e7-4309-ade8-e958aed37dc5" targetNamespace="http://schemas.microsoft.com/office/2006/metadata/properties" ma:root="true" ma:fieldsID="a4560fbd7b0d466bf88880b7e5e2fef7" ns1:_="" ns2:_="" ns3:_="">
     <xsd:import namespace="http://schemas.microsoft.com/sharepoint/v3"/>
@@ -4741,23 +5464,6 @@
 </ct:contentTypeSchema>
 </file>
 
-<file path=customXml/item2.xml><?xml version="1.0" encoding="utf-8"?>
-<p:properties xmlns:p="http://schemas.microsoft.com/office/2006/metadata/properties" xmlns:xsi="http://www.w3.org/2001/XMLSchema-instance" xmlns:pc="http://schemas.microsoft.com/office/infopath/2007/PartnerControls">
-  <documentManagement>
-    <lcf76f155ced4ddcb4097134ff3c332f xmlns="d8713921-ea06-4982-babe-663e602d233a">
-      <Terms xmlns="http://schemas.microsoft.com/office/infopath/2007/PartnerControls"/>
-    </lcf76f155ced4ddcb4097134ff3c332f>
-    <TaxCatchAll xmlns="8cf8b716-41e7-4309-ade8-e958aed37dc5" xsi:nil="true"/>
-    <_ip_UnifiedCompliancePolicyUIAction xmlns="http://schemas.microsoft.com/sharepoint/v3" xsi:nil="true"/>
-    <_ip_UnifiedCompliancePolicyProperties xmlns="http://schemas.microsoft.com/sharepoint/v3" xsi:nil="true"/>
-  </documentManagement>
-</p:properties>
-</file>
-
-<file path=customXml/item3.xml><?xml version="1.0" encoding="utf-8"?>
-<b:Sources xmlns:b="http://schemas.openxmlformats.org/officeDocument/2006/bibliography" xmlns="http://schemas.openxmlformats.org/officeDocument/2006/bibliography" SelectedStyle="\APASixthEditionOfficeOnline.xsl" StyleName="APA" Version="6"/>
-</file>
-
 <file path=customXml/item4.xml><?xml version="1.0" encoding="utf-8"?>
 <?mso-contentType ?>
 <FormTemplates xmlns="http://schemas.microsoft.com/sharepoint/v3/contenttype/forms">
@@ -4768,6 +5474,26 @@
 </file>
 
 <file path=customXml/itemProps1.xml><?xml version="1.0" encoding="utf-8"?>
+<ds:datastoreItem xmlns:ds="http://schemas.openxmlformats.org/officeDocument/2006/customXml" ds:itemID="{0D331028-3AD1-4AB7-9564-A7FD34C62E1F}">
+  <ds:schemaRefs>
+    <ds:schemaRef ds:uri="http://schemas.openxmlformats.org/officeDocument/2006/bibliography"/>
+  </ds:schemaRefs>
+</ds:datastoreItem>
+</file>
+
+<file path=customXml/itemProps2.xml><?xml version="1.0" encoding="utf-8"?>
+<ds:datastoreItem xmlns:ds="http://schemas.openxmlformats.org/officeDocument/2006/customXml" ds:itemID="{82190911-41C4-4D06-B794-349FD0AFF145}">
+  <ds:schemaRefs>
+    <ds:schemaRef ds:uri="http://schemas.microsoft.com/office/2006/metadata/properties"/>
+    <ds:schemaRef ds:uri="http://schemas.microsoft.com/office/infopath/2007/PartnerControls"/>
+    <ds:schemaRef ds:uri="d8713921-ea06-4982-babe-663e602d233a"/>
+    <ds:schemaRef ds:uri="8cf8b716-41e7-4309-ade8-e958aed37dc5"/>
+    <ds:schemaRef ds:uri="http://schemas.microsoft.com/sharepoint/v3"/>
+  </ds:schemaRefs>
+</ds:datastoreItem>
+</file>
+
+<file path=customXml/itemProps3.xml><?xml version="1.0" encoding="utf-8"?>
 <ds:datastoreItem xmlns:ds="http://schemas.openxmlformats.org/officeDocument/2006/customXml" ds:itemID="{3E10CB86-A3BA-468D-9192-C82B6A4BC9DC}">
   <ds:schemaRefs>
     <ds:schemaRef ds:uri="http://schemas.microsoft.com/office/2006/metadata/contentType"/>
@@ -4787,32 +5513,6 @@
 </ds:datastoreItem>
 </file>
 
-<file path=customXml/itemProps2.xml><?xml version="1.0" encoding="utf-8"?>
-<ds:datastoreItem xmlns:ds="http://schemas.openxmlformats.org/officeDocument/2006/customXml" ds:itemID="{82190911-41C4-4D06-B794-349FD0AFF145}">
-  <ds:schemaRefs>
-    <ds:schemaRef ds:uri="http://www.w3.org/XML/1998/namespace"/>
-    <ds:schemaRef ds:uri="http://schemas.microsoft.com/office/2006/metadata/properties"/>
-    <ds:schemaRef ds:uri="http://purl.org/dc/elements/1.1/"/>
-    <ds:schemaRef ds:uri="http://schemas.openxmlformats.org/package/2006/metadata/core-properties"/>
-    <ds:schemaRef ds:uri="http://purl.org/dc/dcmitype/"/>
-    <ds:schemaRef ds:uri="http://purl.org/dc/terms/"/>
-    <ds:schemaRef ds:uri="http://schemas.microsoft.com/office/infopath/2007/PartnerControls"/>
-    <ds:schemaRef ds:uri="http://schemas.microsoft.com/office/2006/documentManagement/types"/>
-    <ds:schemaRef ds:uri="8cf8b716-41e7-4309-ade8-e958aed37dc5"/>
-    <ds:schemaRef ds:uri="d8713921-ea06-4982-babe-663e602d233a"/>
-    <ds:schemaRef ds:uri="http://schemas.microsoft.com/sharepoint/v3"/>
-  </ds:schemaRefs>
-</ds:datastoreItem>
-</file>
-
-<file path=customXml/itemProps3.xml><?xml version="1.0" encoding="utf-8"?>
-<ds:datastoreItem xmlns:ds="http://schemas.openxmlformats.org/officeDocument/2006/customXml" ds:itemID="{0D331028-3AD1-4AB7-9564-A7FD34C62E1F}">
-  <ds:schemaRefs>
-    <ds:schemaRef ds:uri="http://schemas.openxmlformats.org/officeDocument/2006/bibliography"/>
-  </ds:schemaRefs>
-</ds:datastoreItem>
-</file>
-
 <file path=customXml/itemProps4.xml><?xml version="1.0" encoding="utf-8"?>
 <ds:datastoreItem xmlns:ds="http://schemas.openxmlformats.org/officeDocument/2006/customXml" ds:itemID="{E5FB441C-543F-49EF-B482-DCE4E5826BDD}">
   <ds:schemaRefs>

</xml_diff>